<commit_message>
terraform assignment q1 done
</commit_message>
<xml_diff>
--- a/TerraFromCloud.docx
+++ b/TerraFromCloud.docx
@@ -1090,6 +1090,850 @@
         </w:drawing>
       </w:r>
     </w:p>
+    <w:p>
+      <w:pPr>
+        <w:rPr>
+          <w:lang w:val="en-IN"/>
+        </w:rPr>
+      </w:pPr>
+    </w:p>
+    <w:p>
+      <w:pPr>
+        <w:rPr>
+          <w:lang w:val="en-IN"/>
+        </w:rPr>
+      </w:pPr>
+      <w:r>
+        <w:rPr>
+          <w:lang w:val="en-IN"/>
+        </w:rPr>
+        <w:t>3.</w:t>
+      </w:r>
+      <w:r>
+        <w:rPr>
+          <w:lang w:val="en-IN"/>
+        </w:rPr>
+        <w:t>Configure S3 event notifications so that when an object is created under a specific key prefix (e.g.,</w:t>
+      </w:r>
+    </w:p>
+    <w:p>
+      <w:pPr>
+        <w:rPr>
+          <w:lang w:val="en-IN"/>
+        </w:rPr>
+      </w:pPr>
+      <w:r>
+        <w:rPr>
+          <w:lang w:val="en-IN"/>
+        </w:rPr>
+        <w:t>incoming/), S3 publishes a message to the SNS topic.</w:t>
+      </w:r>
+    </w:p>
+    <w:p>
+      <w:pPr>
+        <w:pStyle w:val="NoSpacing"/>
+        <w:rPr>
+          <w:lang w:val="en-IN"/>
+        </w:rPr>
+      </w:pPr>
+      <w:r>
+        <w:rPr>
+          <w:lang w:val="en-IN"/>
+        </w:rPr>
+        <w:t>o Implement path/key filtering requirements:</w:t>
+      </w:r>
+    </w:p>
+    <w:p>
+      <w:pPr>
+        <w:pStyle w:val="NoSpacing"/>
+        <w:rPr>
+          <w:lang w:val="en-IN"/>
+        </w:rPr>
+      </w:pPr>
+      <w:r>
+        <w:rPr>
+          <w:lang w:val="en-IN"/>
+        </w:rPr>
+        <w:t>▪ Only notify for objects under the configured prefix (e.g., incoming/).</w:t>
+      </w:r>
+    </w:p>
+    <w:p>
+      <w:pPr>
+        <w:pStyle w:val="NoSpacing"/>
+        <w:rPr>
+          <w:lang w:val="en-IN"/>
+        </w:rPr>
+      </w:pPr>
+      <w:r>
+        <w:rPr>
+          <w:lang w:val="en-IN"/>
+        </w:rPr>
+        <w:t>▪ Do not notify for “non-file” keys or unwanted paths</w:t>
+      </w:r>
+    </w:p>
+    <w:p>
+      <w:pPr>
+        <w:rPr>
+          <w:lang w:val="en-IN"/>
+        </w:rPr>
+      </w:pPr>
+    </w:p>
+    <w:p>
+      <w:pPr>
+        <w:rPr>
+          <w:lang w:val="en-IN"/>
+        </w:rPr>
+      </w:pPr>
+      <w:r>
+        <w:rPr>
+          <w:lang w:val="en-IN"/>
+        </w:rPr>
+        <w:drawing>
+          <wp:inline distT="0" distB="0" distL="0" distR="0" wp14:anchorId="136AFA0A" wp14:editId="0A072089">
+            <wp:extent cx="6468378" cy="2029108"/>
+            <wp:effectExtent l="0" t="0" r="8890" b="9525"/>
+            <wp:docPr id="759874564" name="Picture 1"/>
+            <wp:cNvGraphicFramePr>
+              <a:graphicFrameLocks xmlns:a="http://schemas.openxmlformats.org/drawingml/2006/main" noChangeAspect="1"/>
+            </wp:cNvGraphicFramePr>
+            <a:graphic xmlns:a="http://schemas.openxmlformats.org/drawingml/2006/main">
+              <a:graphicData uri="http://schemas.openxmlformats.org/drawingml/2006/picture">
+                <pic:pic xmlns:pic="http://schemas.openxmlformats.org/drawingml/2006/picture">
+                  <pic:nvPicPr>
+                    <pic:cNvPr id="759874564" name=""/>
+                    <pic:cNvPicPr/>
+                  </pic:nvPicPr>
+                  <pic:blipFill>
+                    <a:blip r:embed="rId23"/>
+                    <a:stretch>
+                      <a:fillRect/>
+                    </a:stretch>
+                  </pic:blipFill>
+                  <pic:spPr>
+                    <a:xfrm>
+                      <a:off x="0" y="0"/>
+                      <a:ext cx="6468378" cy="2029108"/>
+                    </a:xfrm>
+                    <a:prstGeom prst="rect">
+                      <a:avLst/>
+                    </a:prstGeom>
+                  </pic:spPr>
+                </pic:pic>
+              </a:graphicData>
+            </a:graphic>
+          </wp:inline>
+        </w:drawing>
+      </w:r>
+    </w:p>
+    <w:p>
+      <w:pPr>
+        <w:rPr>
+          <w:lang w:val="en-IN"/>
+        </w:rPr>
+      </w:pPr>
+      <w:r>
+        <w:rPr>
+          <w:lang w:val="en-IN"/>
+        </w:rPr>
+        <w:drawing>
+          <wp:inline distT="0" distB="0" distL="0" distR="0" wp14:anchorId="30A327DF" wp14:editId="7E3D5A58">
+            <wp:extent cx="4039164" cy="895475"/>
+            <wp:effectExtent l="0" t="0" r="0" b="0"/>
+            <wp:docPr id="1459406463" name="Picture 1"/>
+            <wp:cNvGraphicFramePr>
+              <a:graphicFrameLocks xmlns:a="http://schemas.openxmlformats.org/drawingml/2006/main" noChangeAspect="1"/>
+            </wp:cNvGraphicFramePr>
+            <a:graphic xmlns:a="http://schemas.openxmlformats.org/drawingml/2006/main">
+              <a:graphicData uri="http://schemas.openxmlformats.org/drawingml/2006/picture">
+                <pic:pic xmlns:pic="http://schemas.openxmlformats.org/drawingml/2006/picture">
+                  <pic:nvPicPr>
+                    <pic:cNvPr id="1459406463" name=""/>
+                    <pic:cNvPicPr/>
+                  </pic:nvPicPr>
+                  <pic:blipFill>
+                    <a:blip r:embed="rId24"/>
+                    <a:stretch>
+                      <a:fillRect/>
+                    </a:stretch>
+                  </pic:blipFill>
+                  <pic:spPr>
+                    <a:xfrm>
+                      <a:off x="0" y="0"/>
+                      <a:ext cx="4039164" cy="895475"/>
+                    </a:xfrm>
+                    <a:prstGeom prst="rect">
+                      <a:avLst/>
+                    </a:prstGeom>
+                  </pic:spPr>
+                </pic:pic>
+              </a:graphicData>
+            </a:graphic>
+          </wp:inline>
+        </w:drawing>
+      </w:r>
+    </w:p>
+    <w:p>
+      <w:pPr>
+        <w:rPr>
+          <w:lang w:val="en-IN"/>
+        </w:rPr>
+      </w:pPr>
+      <w:r>
+        <w:rPr>
+          <w:lang w:val="en-IN"/>
+        </w:rPr>
+        <w:lastRenderedPageBreak/>
+        <w:t>Create the Q3 Terraform configuration</w:t>
+      </w:r>
+    </w:p>
+    <w:p>
+      <w:pPr>
+        <w:rPr>
+          <w:lang w:val="en-IN"/>
+        </w:rPr>
+      </w:pPr>
+      <w:r>
+        <w:rPr>
+          <w:lang w:val="en-IN"/>
+        </w:rPr>
+        <w:t>Create q3.tf:</w:t>
+      </w:r>
+    </w:p>
+    <w:p>
+      <w:pPr>
+        <w:rPr>
+          <w:lang w:val="en-IN"/>
+        </w:rPr>
+      </w:pPr>
+      <w:r>
+        <w:rPr>
+          <w:lang w:val="en-IN"/>
+        </w:rPr>
+        <w:drawing>
+          <wp:inline distT="0" distB="0" distL="0" distR="0" wp14:anchorId="5FFCDD28" wp14:editId="288A83DA">
+            <wp:extent cx="6858000" cy="3234055"/>
+            <wp:effectExtent l="0" t="0" r="0" b="4445"/>
+            <wp:docPr id="1819500953" name="Picture 1"/>
+            <wp:cNvGraphicFramePr>
+              <a:graphicFrameLocks xmlns:a="http://schemas.openxmlformats.org/drawingml/2006/main" noChangeAspect="1"/>
+            </wp:cNvGraphicFramePr>
+            <a:graphic xmlns:a="http://schemas.openxmlformats.org/drawingml/2006/main">
+              <a:graphicData uri="http://schemas.openxmlformats.org/drawingml/2006/picture">
+                <pic:pic xmlns:pic="http://schemas.openxmlformats.org/drawingml/2006/picture">
+                  <pic:nvPicPr>
+                    <pic:cNvPr id="1819500953" name=""/>
+                    <pic:cNvPicPr/>
+                  </pic:nvPicPr>
+                  <pic:blipFill>
+                    <a:blip r:embed="rId25"/>
+                    <a:stretch>
+                      <a:fillRect/>
+                    </a:stretch>
+                  </pic:blipFill>
+                  <pic:spPr>
+                    <a:xfrm>
+                      <a:off x="0" y="0"/>
+                      <a:ext cx="6858000" cy="3234055"/>
+                    </a:xfrm>
+                    <a:prstGeom prst="rect">
+                      <a:avLst/>
+                    </a:prstGeom>
+                  </pic:spPr>
+                </pic:pic>
+              </a:graphicData>
+            </a:graphic>
+          </wp:inline>
+        </w:drawing>
+      </w:r>
+    </w:p>
+    <w:p>
+      <w:pPr>
+        <w:rPr>
+          <w:lang w:val="en-IN"/>
+        </w:rPr>
+      </w:pPr>
+    </w:p>
+    <w:p>
+      <w:pPr>
+        <w:rPr>
+          <w:lang w:val="en-IN"/>
+        </w:rPr>
+      </w:pPr>
+      <w:r>
+        <w:rPr>
+          <w:lang w:val="en-IN"/>
+        </w:rPr>
+        <w:drawing>
+          <wp:inline distT="0" distB="0" distL="0" distR="0" wp14:anchorId="0492D0CA" wp14:editId="0F6096E0">
+            <wp:extent cx="4525006" cy="647790"/>
+            <wp:effectExtent l="0" t="0" r="9525" b="0"/>
+            <wp:docPr id="1719872311" name="Picture 1"/>
+            <wp:cNvGraphicFramePr>
+              <a:graphicFrameLocks xmlns:a="http://schemas.openxmlformats.org/drawingml/2006/main" noChangeAspect="1"/>
+            </wp:cNvGraphicFramePr>
+            <a:graphic xmlns:a="http://schemas.openxmlformats.org/drawingml/2006/main">
+              <a:graphicData uri="http://schemas.openxmlformats.org/drawingml/2006/picture">
+                <pic:pic xmlns:pic="http://schemas.openxmlformats.org/drawingml/2006/picture">
+                  <pic:nvPicPr>
+                    <pic:cNvPr id="1719872311" name=""/>
+                    <pic:cNvPicPr/>
+                  </pic:nvPicPr>
+                  <pic:blipFill>
+                    <a:blip r:embed="rId26"/>
+                    <a:stretch>
+                      <a:fillRect/>
+                    </a:stretch>
+                  </pic:blipFill>
+                  <pic:spPr>
+                    <a:xfrm>
+                      <a:off x="0" y="0"/>
+                      <a:ext cx="4525006" cy="647790"/>
+                    </a:xfrm>
+                    <a:prstGeom prst="rect">
+                      <a:avLst/>
+                    </a:prstGeom>
+                  </pic:spPr>
+                </pic:pic>
+              </a:graphicData>
+            </a:graphic>
+          </wp:inline>
+        </w:drawing>
+      </w:r>
+    </w:p>
+    <w:p>
+      <w:pPr>
+        <w:rPr>
+          <w:lang w:val="en-IN"/>
+        </w:rPr>
+      </w:pPr>
+    </w:p>
+    <w:p>
+      <w:pPr>
+        <w:rPr>
+          <w:lang w:val="en-IN"/>
+        </w:rPr>
+      </w:pPr>
+    </w:p>
+    <w:p>
+      <w:pPr>
+        <w:rPr>
+          <w:lang w:val="en-IN"/>
+        </w:rPr>
+      </w:pPr>
+    </w:p>
+    <w:p>
+      <w:pPr>
+        <w:rPr>
+          <w:lang w:val="en-IN"/>
+        </w:rPr>
+      </w:pPr>
+    </w:p>
+    <w:p>
+      <w:pPr>
+        <w:rPr>
+          <w:lang w:val="en-IN"/>
+        </w:rPr>
+      </w:pPr>
+    </w:p>
+    <w:p>
+      <w:pPr>
+        <w:rPr>
+          <w:lang w:val="en-IN"/>
+        </w:rPr>
+      </w:pPr>
+    </w:p>
+    <w:p>
+      <w:pPr>
+        <w:rPr>
+          <w:lang w:val="en-IN"/>
+        </w:rPr>
+      </w:pPr>
+    </w:p>
+    <w:p>
+      <w:pPr>
+        <w:rPr>
+          <w:lang w:val="en-IN"/>
+        </w:rPr>
+      </w:pPr>
+    </w:p>
+    <w:p>
+      <w:pPr>
+        <w:rPr>
+          <w:lang w:val="en-IN"/>
+        </w:rPr>
+      </w:pPr>
+    </w:p>
+    <w:p>
+      <w:pPr>
+        <w:rPr>
+          <w:lang w:val="en-IN"/>
+        </w:rPr>
+      </w:pPr>
+    </w:p>
+    <w:p>
+      <w:pPr>
+        <w:rPr>
+          <w:lang w:val="en-IN"/>
+        </w:rPr>
+      </w:pPr>
+    </w:p>
+    <w:p>
+      <w:pPr>
+        <w:rPr>
+          <w:lang w:val="en-IN"/>
+        </w:rPr>
+      </w:pPr>
+    </w:p>
+    <w:p>
+      <w:pPr>
+        <w:rPr>
+          <w:lang w:val="en-IN"/>
+        </w:rPr>
+      </w:pPr>
+    </w:p>
+    <w:p>
+      <w:pPr>
+        <w:rPr>
+          <w:lang w:val="en-IN"/>
+        </w:rPr>
+      </w:pPr>
+      <w:r>
+        <w:rPr>
+          <w:lang w:val="en-IN"/>
+        </w:rPr>
+        <w:lastRenderedPageBreak/>
+        <w:t>terraform plan -out=q3.tfplan</w:t>
+      </w:r>
+    </w:p>
+    <w:p>
+      <w:pPr>
+        <w:rPr>
+          <w:lang w:val="en-IN"/>
+        </w:rPr>
+      </w:pPr>
+      <w:r>
+        <w:rPr>
+          <w:lang w:val="en-IN"/>
+        </w:rPr>
+        <w:drawing>
+          <wp:inline distT="0" distB="0" distL="0" distR="0" wp14:anchorId="5D44B0DA" wp14:editId="6C5EA3B9">
+            <wp:extent cx="6858000" cy="4589145"/>
+            <wp:effectExtent l="0" t="0" r="0" b="1905"/>
+            <wp:docPr id="813928385" name="Picture 1"/>
+            <wp:cNvGraphicFramePr>
+              <a:graphicFrameLocks xmlns:a="http://schemas.openxmlformats.org/drawingml/2006/main" noChangeAspect="1"/>
+            </wp:cNvGraphicFramePr>
+            <a:graphic xmlns:a="http://schemas.openxmlformats.org/drawingml/2006/main">
+              <a:graphicData uri="http://schemas.openxmlformats.org/drawingml/2006/picture">
+                <pic:pic xmlns:pic="http://schemas.openxmlformats.org/drawingml/2006/picture">
+                  <pic:nvPicPr>
+                    <pic:cNvPr id="813928385" name=""/>
+                    <pic:cNvPicPr/>
+                  </pic:nvPicPr>
+                  <pic:blipFill>
+                    <a:blip r:embed="rId27"/>
+                    <a:stretch>
+                      <a:fillRect/>
+                    </a:stretch>
+                  </pic:blipFill>
+                  <pic:spPr>
+                    <a:xfrm>
+                      <a:off x="0" y="0"/>
+                      <a:ext cx="6858000" cy="4589145"/>
+                    </a:xfrm>
+                    <a:prstGeom prst="rect">
+                      <a:avLst/>
+                    </a:prstGeom>
+                  </pic:spPr>
+                </pic:pic>
+              </a:graphicData>
+            </a:graphic>
+          </wp:inline>
+        </w:drawing>
+      </w:r>
+    </w:p>
+    <w:p>
+      <w:r>
+        <w:drawing>
+          <wp:inline distT="0" distB="0" distL="0" distR="0" wp14:anchorId="4E0D96F1" wp14:editId="6A784662">
+            <wp:extent cx="6858000" cy="2282825"/>
+            <wp:effectExtent l="0" t="0" r="0" b="3175"/>
+            <wp:docPr id="998844953" name="Picture 1"/>
+            <wp:cNvGraphicFramePr>
+              <a:graphicFrameLocks xmlns:a="http://schemas.openxmlformats.org/drawingml/2006/main" noChangeAspect="1"/>
+            </wp:cNvGraphicFramePr>
+            <a:graphic xmlns:a="http://schemas.openxmlformats.org/drawingml/2006/main">
+              <a:graphicData uri="http://schemas.openxmlformats.org/drawingml/2006/picture">
+                <pic:pic xmlns:pic="http://schemas.openxmlformats.org/drawingml/2006/picture">
+                  <pic:nvPicPr>
+                    <pic:cNvPr id="998844953" name=""/>
+                    <pic:cNvPicPr/>
+                  </pic:nvPicPr>
+                  <pic:blipFill>
+                    <a:blip r:embed="rId28"/>
+                    <a:stretch>
+                      <a:fillRect/>
+                    </a:stretch>
+                  </pic:blipFill>
+                  <pic:spPr>
+                    <a:xfrm>
+                      <a:off x="0" y="0"/>
+                      <a:ext cx="6858000" cy="2282825"/>
+                    </a:xfrm>
+                    <a:prstGeom prst="rect">
+                      <a:avLst/>
+                    </a:prstGeom>
+                  </pic:spPr>
+                </pic:pic>
+              </a:graphicData>
+            </a:graphic>
+          </wp:inline>
+        </w:drawing>
+      </w:r>
+    </w:p>
+    <w:p>
+      <w:pPr>
+        <w:rPr>
+          <w:lang w:val="en-IN"/>
+        </w:rPr>
+      </w:pPr>
+      <w:r>
+        <w:t xml:space="preserve">Resources added    </w:t>
+      </w:r>
+      <w:r>
+        <w:br/>
+      </w:r>
+      <w:r>
+        <w:rPr>
+          <w:lang w:val="en-IN"/>
+        </w:rPr>
+        <w:t>aws_sns_topic_</w:t>
+      </w:r>
+      <w:proofErr w:type="gramStart"/>
+      <w:r>
+        <w:rPr>
+          <w:lang w:val="en-IN"/>
+        </w:rPr>
+        <w:t>policy.allow</w:t>
+      </w:r>
+      <w:proofErr w:type="gramEnd"/>
+      <w:r>
+        <w:rPr>
+          <w:lang w:val="en-IN"/>
+        </w:rPr>
+        <w:t xml:space="preserve">_s3_publish </w:t>
+      </w:r>
+      <w:r>
+        <w:rPr>
+          <w:lang w:val="en-IN"/>
+        </w:rPr>
+        <w:br/>
+      </w:r>
+      <w:r>
+        <w:rPr>
+          <w:lang w:val="en-IN"/>
+        </w:rPr>
+        <w:t>aws_s3_bucket_</w:t>
+      </w:r>
+      <w:proofErr w:type="gramStart"/>
+      <w:r>
+        <w:rPr>
+          <w:lang w:val="en-IN"/>
+        </w:rPr>
+        <w:t>notification.secure</w:t>
+      </w:r>
+      <w:proofErr w:type="gramEnd"/>
+    </w:p>
+    <w:p/>
+    <w:p/>
+    <w:p/>
+    <w:p>
+      <w:pPr>
+        <w:pStyle w:val="ListParagraph"/>
+        <w:numPr>
+          <w:ilvl w:val="0"/>
+          <w:numId w:val="2"/>
+        </w:numPr>
+      </w:pPr>
+      <w:r>
+        <w:lastRenderedPageBreak/>
+        <w:t>Use appropriate bucket and IAM/SNS policies following least privilege, including (as applicable)</w:t>
+      </w:r>
+      <w:proofErr w:type="gramStart"/>
+      <w:r>
+        <w:t>: o</w:t>
+      </w:r>
+      <w:proofErr w:type="gramEnd"/>
+      <w:r>
+        <w:t xml:space="preserve"> Allowing S3 to publish to SNS only from your bucket (restrict by bucket ARN and account/region conditions where supported). o Ensuring the bucket is not publicly accessible and access is explicitly controlled.</w:t>
+      </w:r>
+    </w:p>
+    <w:p>
+      <w:proofErr w:type="gramStart"/>
+      <w:r>
+        <w:t>Strengthen</w:t>
+      </w:r>
+      <w:proofErr w:type="gramEnd"/>
+      <w:r>
+        <w:t xml:space="preserve"> the existing SNS topic policy</w:t>
+      </w:r>
+    </w:p>
+    <w:p>
+      <w:r>
+        <w:t>update</w:t>
+      </w:r>
+      <w:r>
+        <w:t xml:space="preserve"> Q3 fil</w:t>
+      </w:r>
+      <w:r>
+        <w:t>e</w:t>
+      </w:r>
+    </w:p>
+    <w:p/>
+    <w:p>
+      <w:pPr>
+        <w:pStyle w:val="NoSpacing"/>
+      </w:pPr>
+      <w:r>
+        <w:t>data "</w:t>
+      </w:r>
+      <w:proofErr w:type="spellStart"/>
+      <w:r>
+        <w:t>aws_iam_policy_document</w:t>
+      </w:r>
+      <w:proofErr w:type="spellEnd"/>
+      <w:r>
+        <w:t>" "allow_s3_publish_to_</w:t>
+      </w:r>
+      <w:proofErr w:type="gramStart"/>
+      <w:r>
+        <w:t>sns" {</w:t>
+      </w:r>
+      <w:proofErr w:type="gramEnd"/>
+    </w:p>
+    <w:p>
+      <w:pPr>
+        <w:pStyle w:val="NoSpacing"/>
+      </w:pPr>
+      <w:r>
+        <w:t xml:space="preserve">  statement {</w:t>
+      </w:r>
+    </w:p>
+    <w:p>
+      <w:pPr>
+        <w:pStyle w:val="NoSpacing"/>
+      </w:pPr>
+      <w:r>
+        <w:t xml:space="preserve">    </w:t>
+      </w:r>
+      <w:proofErr w:type="spellStart"/>
+      <w:r>
+        <w:t>sid</w:t>
+      </w:r>
+      <w:proofErr w:type="spellEnd"/>
+      <w:r>
+        <w:t xml:space="preserve">    = "</w:t>
+      </w:r>
+      <w:proofErr w:type="spellStart"/>
+      <w:r>
+        <w:t>AllowOnlyThisBucketToPublish</w:t>
+      </w:r>
+      <w:proofErr w:type="spellEnd"/>
+      <w:r>
+        <w:t>"</w:t>
+      </w:r>
+    </w:p>
+    <w:p>
+      <w:pPr>
+        <w:pStyle w:val="NoSpacing"/>
+      </w:pPr>
+      <w:r>
+        <w:t xml:space="preserve">    effect = "Allow"</w:t>
+      </w:r>
+    </w:p>
+    <w:p>
+      <w:pPr>
+        <w:pStyle w:val="NoSpacing"/>
+      </w:pPr>
+    </w:p>
+    <w:p>
+      <w:pPr>
+        <w:pStyle w:val="NoSpacing"/>
+      </w:pPr>
+      <w:r>
+        <w:drawing>
+          <wp:inline distT="0" distB="0" distL="0" distR="0" wp14:anchorId="1E028206" wp14:editId="29126DCF">
+            <wp:extent cx="6858000" cy="3811270"/>
+            <wp:effectExtent l="0" t="0" r="0" b="0"/>
+            <wp:docPr id="1906118408" name="Picture 1"/>
+            <wp:cNvGraphicFramePr>
+              <a:graphicFrameLocks xmlns:a="http://schemas.openxmlformats.org/drawingml/2006/main" noChangeAspect="1"/>
+            </wp:cNvGraphicFramePr>
+            <a:graphic xmlns:a="http://schemas.openxmlformats.org/drawingml/2006/main">
+              <a:graphicData uri="http://schemas.openxmlformats.org/drawingml/2006/picture">
+                <pic:pic xmlns:pic="http://schemas.openxmlformats.org/drawingml/2006/picture">
+                  <pic:nvPicPr>
+                    <pic:cNvPr id="1906118408" name=""/>
+                    <pic:cNvPicPr/>
+                  </pic:nvPicPr>
+                  <pic:blipFill>
+                    <a:blip r:embed="rId29"/>
+                    <a:stretch>
+                      <a:fillRect/>
+                    </a:stretch>
+                  </pic:blipFill>
+                  <pic:spPr>
+                    <a:xfrm>
+                      <a:off x="0" y="0"/>
+                      <a:ext cx="6858000" cy="3811270"/>
+                    </a:xfrm>
+                    <a:prstGeom prst="rect">
+                      <a:avLst/>
+                    </a:prstGeom>
+                  </pic:spPr>
+                </pic:pic>
+              </a:graphicData>
+            </a:graphic>
+          </wp:inline>
+        </w:drawing>
+      </w:r>
+    </w:p>
+    <w:p>
+      <w:pPr>
+        <w:pStyle w:val="NoSpacing"/>
+      </w:pPr>
+    </w:p>
+    <w:p>
+      <w:r>
+        <w:drawing>
+          <wp:inline distT="0" distB="0" distL="0" distR="0" wp14:anchorId="621DDAC4" wp14:editId="2E5E71A3">
+            <wp:extent cx="3962953" cy="504895"/>
+            <wp:effectExtent l="0" t="0" r="0" b="9525"/>
+            <wp:docPr id="1413687820" name="Picture 1"/>
+            <wp:cNvGraphicFramePr>
+              <a:graphicFrameLocks xmlns:a="http://schemas.openxmlformats.org/drawingml/2006/main" noChangeAspect="1"/>
+            </wp:cNvGraphicFramePr>
+            <a:graphic xmlns:a="http://schemas.openxmlformats.org/drawingml/2006/main">
+              <a:graphicData uri="http://schemas.openxmlformats.org/drawingml/2006/picture">
+                <pic:pic xmlns:pic="http://schemas.openxmlformats.org/drawingml/2006/picture">
+                  <pic:nvPicPr>
+                    <pic:cNvPr id="1413687820" name=""/>
+                    <pic:cNvPicPr/>
+                  </pic:nvPicPr>
+                  <pic:blipFill>
+                    <a:blip r:embed="rId30"/>
+                    <a:stretch>
+                      <a:fillRect/>
+                    </a:stretch>
+                  </pic:blipFill>
+                  <pic:spPr>
+                    <a:xfrm>
+                      <a:off x="0" y="0"/>
+                      <a:ext cx="3962953" cy="504895"/>
+                    </a:xfrm>
+                    <a:prstGeom prst="rect">
+                      <a:avLst/>
+                    </a:prstGeom>
+                  </pic:spPr>
+                </pic:pic>
+              </a:graphicData>
+            </a:graphic>
+          </wp:inline>
+        </w:drawing>
+      </w:r>
+    </w:p>
+    <w:p>
+      <w:pPr>
+        <w:rPr>
+          <w:lang w:val="en-IN"/>
+        </w:rPr>
+      </w:pPr>
+      <w:r>
+        <w:rPr>
+          <w:lang w:val="en-IN"/>
+        </w:rPr>
+        <w:t>terraform plan -out=q4.tfplan</w:t>
+      </w:r>
+    </w:p>
+    <w:p>
+      <w:r>
+        <w:lastRenderedPageBreak/>
+        <w:drawing>
+          <wp:inline distT="0" distB="0" distL="0" distR="0" wp14:anchorId="6A5BF87F" wp14:editId="32DA1F2F">
+            <wp:extent cx="6858000" cy="3364865"/>
+            <wp:effectExtent l="0" t="0" r="0" b="6985"/>
+            <wp:docPr id="473838854" name="Picture 1"/>
+            <wp:cNvGraphicFramePr>
+              <a:graphicFrameLocks xmlns:a="http://schemas.openxmlformats.org/drawingml/2006/main" noChangeAspect="1"/>
+            </wp:cNvGraphicFramePr>
+            <a:graphic xmlns:a="http://schemas.openxmlformats.org/drawingml/2006/main">
+              <a:graphicData uri="http://schemas.openxmlformats.org/drawingml/2006/picture">
+                <pic:pic xmlns:pic="http://schemas.openxmlformats.org/drawingml/2006/picture">
+                  <pic:nvPicPr>
+                    <pic:cNvPr id="473838854" name=""/>
+                    <pic:cNvPicPr/>
+                  </pic:nvPicPr>
+                  <pic:blipFill>
+                    <a:blip r:embed="rId31"/>
+                    <a:stretch>
+                      <a:fillRect/>
+                    </a:stretch>
+                  </pic:blipFill>
+                  <pic:spPr>
+                    <a:xfrm>
+                      <a:off x="0" y="0"/>
+                      <a:ext cx="6858000" cy="3364865"/>
+                    </a:xfrm>
+                    <a:prstGeom prst="rect">
+                      <a:avLst/>
+                    </a:prstGeom>
+                  </pic:spPr>
+                </pic:pic>
+              </a:graphicData>
+            </a:graphic>
+          </wp:inline>
+        </w:drawing>
+      </w:r>
+    </w:p>
+    <w:p>
+      <w:r>
+        <w:drawing>
+          <wp:inline distT="0" distB="0" distL="0" distR="0" wp14:anchorId="6E481AA4" wp14:editId="003F7477">
+            <wp:extent cx="6858000" cy="1429385"/>
+            <wp:effectExtent l="0" t="0" r="0" b="0"/>
+            <wp:docPr id="1642942355" name="Picture 1"/>
+            <wp:cNvGraphicFramePr>
+              <a:graphicFrameLocks xmlns:a="http://schemas.openxmlformats.org/drawingml/2006/main" noChangeAspect="1"/>
+            </wp:cNvGraphicFramePr>
+            <a:graphic xmlns:a="http://schemas.openxmlformats.org/drawingml/2006/main">
+              <a:graphicData uri="http://schemas.openxmlformats.org/drawingml/2006/picture">
+                <pic:pic xmlns:pic="http://schemas.openxmlformats.org/drawingml/2006/picture">
+                  <pic:nvPicPr>
+                    <pic:cNvPr id="1642942355" name=""/>
+                    <pic:cNvPicPr/>
+                  </pic:nvPicPr>
+                  <pic:blipFill>
+                    <a:blip r:embed="rId32"/>
+                    <a:stretch>
+                      <a:fillRect/>
+                    </a:stretch>
+                  </pic:blipFill>
+                  <pic:spPr>
+                    <a:xfrm>
+                      <a:off x="0" y="0"/>
+                      <a:ext cx="6858000" cy="1429385"/>
+                    </a:xfrm>
+                    <a:prstGeom prst="rect">
+                      <a:avLst/>
+                    </a:prstGeom>
+                  </pic:spPr>
+                </pic:pic>
+              </a:graphicData>
+            </a:graphic>
+          </wp:inline>
+        </w:drawing>
+      </w:r>
+    </w:p>
     <w:p/>
     <w:p/>
     <w:p/>
@@ -1104,8 +1948,6 @@
     <w:p/>
     <w:p/>
     <w:p/>
-    <w:p/>
-    <w:p/>
     <w:p>
       <w:pPr>
         <w:rPr>
@@ -1117,7 +1959,6 @@
         <w:rPr>
           <w:lang w:val="en-IN"/>
         </w:rPr>
-        <w:lastRenderedPageBreak/>
         <w:t>sudo</w:t>
       </w:r>
       <w:proofErr w:type="spellEnd"/>
@@ -1301,8 +2142,100 @@
       </w:pPr>
     </w:lvl>
   </w:abstractNum>
+  <w:abstractNum w:abstractNumId="1" w15:restartNumberingAfterBreak="0">
+    <w:nsid w:val="74681472"/>
+    <w:multiLevelType w:val="hybridMultilevel"/>
+    <w:tmpl w:val="F224DFE6"/>
+    <w:lvl w:ilvl="0" w:tplc="4009000F">
+      <w:start w:val="4"/>
+      <w:numFmt w:val="decimal"/>
+      <w:lvlText w:val="%1."/>
+      <w:lvlJc w:val="left"/>
+      <w:pPr>
+        <w:ind w:left="720" w:hanging="360"/>
+      </w:pPr>
+      <w:rPr>
+        <w:rFonts w:hint="default"/>
+      </w:rPr>
+    </w:lvl>
+    <w:lvl w:ilvl="1" w:tplc="40090019" w:tentative="1">
+      <w:start w:val="1"/>
+      <w:numFmt w:val="lowerLetter"/>
+      <w:lvlText w:val="%2."/>
+      <w:lvlJc w:val="left"/>
+      <w:pPr>
+        <w:ind w:left="1440" w:hanging="360"/>
+      </w:pPr>
+    </w:lvl>
+    <w:lvl w:ilvl="2" w:tplc="4009001B" w:tentative="1">
+      <w:start w:val="1"/>
+      <w:numFmt w:val="lowerRoman"/>
+      <w:lvlText w:val="%3."/>
+      <w:lvlJc w:val="right"/>
+      <w:pPr>
+        <w:ind w:left="2160" w:hanging="180"/>
+      </w:pPr>
+    </w:lvl>
+    <w:lvl w:ilvl="3" w:tplc="4009000F" w:tentative="1">
+      <w:start w:val="1"/>
+      <w:numFmt w:val="decimal"/>
+      <w:lvlText w:val="%4."/>
+      <w:lvlJc w:val="left"/>
+      <w:pPr>
+        <w:ind w:left="2880" w:hanging="360"/>
+      </w:pPr>
+    </w:lvl>
+    <w:lvl w:ilvl="4" w:tplc="40090019" w:tentative="1">
+      <w:start w:val="1"/>
+      <w:numFmt w:val="lowerLetter"/>
+      <w:lvlText w:val="%5."/>
+      <w:lvlJc w:val="left"/>
+      <w:pPr>
+        <w:ind w:left="3600" w:hanging="360"/>
+      </w:pPr>
+    </w:lvl>
+    <w:lvl w:ilvl="5" w:tplc="4009001B" w:tentative="1">
+      <w:start w:val="1"/>
+      <w:numFmt w:val="lowerRoman"/>
+      <w:lvlText w:val="%6."/>
+      <w:lvlJc w:val="right"/>
+      <w:pPr>
+        <w:ind w:left="4320" w:hanging="180"/>
+      </w:pPr>
+    </w:lvl>
+    <w:lvl w:ilvl="6" w:tplc="4009000F" w:tentative="1">
+      <w:start w:val="1"/>
+      <w:numFmt w:val="decimal"/>
+      <w:lvlText w:val="%7."/>
+      <w:lvlJc w:val="left"/>
+      <w:pPr>
+        <w:ind w:left="5040" w:hanging="360"/>
+      </w:pPr>
+    </w:lvl>
+    <w:lvl w:ilvl="7" w:tplc="40090019" w:tentative="1">
+      <w:start w:val="1"/>
+      <w:numFmt w:val="lowerLetter"/>
+      <w:lvlText w:val="%8."/>
+      <w:lvlJc w:val="left"/>
+      <w:pPr>
+        <w:ind w:left="5760" w:hanging="360"/>
+      </w:pPr>
+    </w:lvl>
+    <w:lvl w:ilvl="8" w:tplc="4009001B" w:tentative="1">
+      <w:start w:val="1"/>
+      <w:numFmt w:val="lowerRoman"/>
+      <w:lvlText w:val="%9."/>
+      <w:lvlJc w:val="right"/>
+      <w:pPr>
+        <w:ind w:left="6480" w:hanging="180"/>
+      </w:pPr>
+    </w:lvl>
+  </w:abstractNum>
   <w:num w:numId="1" w16cid:durableId="236985294">
     <w:abstractNumId w:val="0"/>
+  </w:num>
+  <w:num w:numId="2" w16cid:durableId="592082374">
+    <w:abstractNumId w:val="1"/>
   </w:num>
 </w:numbering>
 </file>
@@ -2544,6 +3477,6 @@
 
 <file path=docMetadata/LabelInfo.xml><?xml version="1.0" encoding="utf-8"?>
 <clbl:labelList xmlns:clbl="http://schemas.microsoft.com/office/2020/mipLabelMetadata">
-  <clbl:label id="{ea60d57e-af5b-4752-ac57-3e4f28ca11dc}" enabled="1" method="Standard" siteId="{36da45f1-dd2c-4d1f-af13-5abe46b99921}" contentBits="0" removed="0"/>
+  <clbl:label id="{ea60d57e-af5b-4752-ac57-3e4f28ca11dc}" enabled="1" method="Standard" siteId="{36da45f1-dd2c-4d1f-af13-5abe46b99921}" removed="0"/>
 </clbl:labelList>
 </file>
</xml_diff>